<commit_message>
Actualizacion automatica 2026-10-26 16:47:21 -0500
</commit_message>
<xml_diff>
--- a/Avances Proyecto/Documentación/Instrumentos Amilkar Suárez.docx
+++ b/Avances Proyecto/Documentación/Instrumentos Amilkar Suárez.docx
@@ -9992,21 +9992,19 @@
         <w:rPr>
           <w:lang w:val="es-EC"/>
         </w:rPr>
-        <w:t xml:space="preserve">¿Cómo se realiza actualmente el riego del huerto escolar y del </w:t>
-      </w:r>
-      <w:proofErr w:type="spellStart"/>
+        <w:t xml:space="preserve">¿Cómo se realiza actualmente el riego del </w:t>
+      </w:r>
       <w:r>
         <w:rPr>
           <w:lang w:val="es-EC"/>
         </w:rPr>
-        <w:t>Ecotini</w:t>
-      </w:r>
-      <w:proofErr w:type="spellEnd"/>
+        <w:t>área trasera de la cancha principal</w:t>
+      </w:r>
       <w:r>
         <w:rPr>
           <w:lang w:val="es-EC"/>
         </w:rPr>
-        <w:t>, y con qué frecuencia se riegan estas áreas?</w:t>
+        <w:t>, y con qué frecuencia se riega?</w:t>
       </w:r>
     </w:p>
     <w:p>
@@ -10054,21 +10052,19 @@
         <w:rPr>
           <w:lang w:val="es-EC"/>
         </w:rPr>
-        <w:t xml:space="preserve">¿Existen diferencias entre las necesidades de riego del huerto escolar y las del </w:t>
-      </w:r>
-      <w:proofErr w:type="spellStart"/>
+        <w:t>¿Existen diferencias entre las necesidades de riego d</w:t>
+      </w:r>
       <w:r>
         <w:rPr>
           <w:lang w:val="es-EC"/>
         </w:rPr>
-        <w:t>Ecotini</w:t>
-      </w:r>
-      <w:proofErr w:type="spellEnd"/>
+        <w:t>e las distintas plantas del área circundante?</w:t>
+      </w:r>
       <w:r>
         <w:rPr>
           <w:lang w:val="es-EC"/>
         </w:rPr>
-        <w:t>? ¿Cuáles son las principales?</w:t>
+        <w:t xml:space="preserve"> ¿Cuáles son las principales?</w:t>
       </w:r>
     </w:p>
     <w:p>
@@ -10188,21 +10184,7 @@
         <w:rPr>
           <w:lang w:val="es-EC"/>
         </w:rPr>
-        <w:t xml:space="preserve">¿Considera que un aspersor por área podría cubrir adecuadamente la zona seleccionada del huerto escolar y del </w:t>
-      </w:r>
-      <w:proofErr w:type="spellStart"/>
-      <w:r>
-        <w:rPr>
-          <w:lang w:val="es-EC"/>
-        </w:rPr>
-        <w:t>Ecotini</w:t>
-      </w:r>
-      <w:proofErr w:type="spellEnd"/>
-      <w:r>
-        <w:rPr>
-          <w:lang w:val="es-EC"/>
-        </w:rPr>
-        <w:t>? ¿Qué aspectos deberían tomarse en cuenta para ubicarlo?</w:t>
+        <w:t>¿Considera que un aspersor por área podría cubrir adecuadamente la zona? ¿Qué aspectos deberían tomarse en cuenta para ubicarlo?</w:t>
       </w:r>
     </w:p>
     <w:p>
@@ -10250,16 +10232,14 @@
         <w:rPr>
           <w:lang w:val="es-EC"/>
         </w:rPr>
-        <w:t xml:space="preserve">¿Qué condiciones considera importantes para que un sistema automático de riego sea realmente útil y compatible con el mantenimiento habitual del huerto escolar y del </w:t>
-      </w:r>
-      <w:proofErr w:type="spellStart"/>
+        <w:t xml:space="preserve">¿Qué condiciones considera importantes para que un sistema automático de riego sea realmente útil y compatible con el mantenimiento habitual del </w:t>
+      </w:r>
       <w:r>
         <w:rPr>
           <w:lang w:val="es-EC"/>
         </w:rPr>
-        <w:t>Ecotini</w:t>
-      </w:r>
-      <w:proofErr w:type="spellEnd"/>
+        <w:t>lugar</w:t>
+      </w:r>
       <w:r>
         <w:rPr>
           <w:lang w:val="es-EC"/>
@@ -10847,6 +10827,7 @@
   <w:style w:type="character" w:default="1" w:styleId="Fuentedeprrafopredeter">
     <w:name w:val="Default Paragraph Font"/>
     <w:uiPriority w:val="1"/>
+    <w:semiHidden/>
     <w:unhideWhenUsed/>
   </w:style>
   <w:style w:type="table" w:default="1" w:styleId="Tablanormal">
@@ -11218,27 +11199,6 @@
 </file>
 
 <file path=customXml/item1.xml><?xml version="1.0" encoding="utf-8"?>
-<?mso-contentType ?>
-<FormTemplates xmlns="http://schemas.microsoft.com/sharepoint/v3/contenttype/forms">
-  <Display>DocumentLibraryForm</Display>
-  <Edit>DocumentLibraryForm</Edit>
-  <New>DocumentLibraryForm</New>
-</FormTemplates>
-</file>
-
-<file path=customXml/item2.xml><?xml version="1.0" encoding="utf-8"?>
-<p:properties xmlns:p="http://schemas.microsoft.com/office/2006/metadata/properties" xmlns:xsi="http://www.w3.org/2001/XMLSchema-instance" xmlns:pc="http://schemas.microsoft.com/office/infopath/2007/PartnerControls">
-  <documentManagement>
-    <TaxCatchAll xmlns="17a9adf4-9a1b-4240-81a0-63b7c14ff34a" xsi:nil="true"/>
-    <lcf76f155ced4ddcb4097134ff3c332f xmlns="3fcda13f-2903-41b7-b192-baf7b356d0a8">
-      <Terms xmlns="http://schemas.microsoft.com/office/infopath/2007/PartnerControls"/>
-    </lcf76f155ced4ddcb4097134ff3c332f>
-    <ReferenceId xmlns="3fcda13f-2903-41b7-b192-baf7b356d0a8" xsi:nil="true"/>
-  </documentManagement>
-</p:properties>
-</file>
-
-<file path=customXml/item3.xml><?xml version="1.0" encoding="utf-8"?>
 <ct:contentTypeSchema xmlns:ct="http://schemas.microsoft.com/office/2006/metadata/contentType" xmlns:ma="http://schemas.microsoft.com/office/2006/metadata/properties/metaAttributes" ct:_="" ma:_="" ma:contentTypeName="Documento" ma:contentTypeID="0x010100FF21F483A63D5A4CBDDD0537FE39855C" ma:contentTypeVersion="12" ma:contentTypeDescription="Crear nuevo documento." ma:contentTypeScope="" ma:versionID="8bc530316e38bdb0116a29d76ba339ed">
   <xsd:schema xmlns:xsd="http://www.w3.org/2001/XMLSchema" xmlns:xs="http://www.w3.org/2001/XMLSchema" xmlns:p="http://schemas.microsoft.com/office/2006/metadata/properties" xmlns:ns2="3fcda13f-2903-41b7-b192-baf7b356d0a8" xmlns:ns3="17a9adf4-9a1b-4240-81a0-63b7c14ff34a" targetNamespace="http://schemas.microsoft.com/office/2006/metadata/properties" ma:root="true" ma:fieldsID="5292c3c555279397b9c86888dfda3f07" ns2:_="" ns3:_="">
     <xsd:import namespace="3fcda13f-2903-41b7-b192-baf7b356d0a8"/>
@@ -11439,10 +11399,42 @@
 </ct:contentTypeSchema>
 </file>
 
+<file path=customXml/item2.xml><?xml version="1.0" encoding="utf-8"?>
+<p:properties xmlns:p="http://schemas.microsoft.com/office/2006/metadata/properties" xmlns:xsi="http://www.w3.org/2001/XMLSchema-instance" xmlns:pc="http://schemas.microsoft.com/office/infopath/2007/PartnerControls">
+  <documentManagement>
+    <TaxCatchAll xmlns="17a9adf4-9a1b-4240-81a0-63b7c14ff34a" xsi:nil="true"/>
+    <lcf76f155ced4ddcb4097134ff3c332f xmlns="3fcda13f-2903-41b7-b192-baf7b356d0a8">
+      <Terms xmlns="http://schemas.microsoft.com/office/infopath/2007/PartnerControls"/>
+    </lcf76f155ced4ddcb4097134ff3c332f>
+    <ReferenceId xmlns="3fcda13f-2903-41b7-b192-baf7b356d0a8" xsi:nil="true"/>
+  </documentManagement>
+</p:properties>
+</file>
+
+<file path=customXml/item3.xml><?xml version="1.0" encoding="utf-8"?>
+<?mso-contentType ?>
+<FormTemplates xmlns="http://schemas.microsoft.com/sharepoint/v3/contenttype/forms">
+  <Display>DocumentLibraryForm</Display>
+  <Edit>DocumentLibraryForm</Edit>
+  <New>DocumentLibraryForm</New>
+</FormTemplates>
+</file>
+
 <file path=customXml/itemProps1.xml><?xml version="1.0" encoding="utf-8"?>
-<ds:datastoreItem xmlns:ds="http://schemas.openxmlformats.org/officeDocument/2006/customXml" ds:itemID="{3577A3A9-82C0-47A6-A1C5-B6DE42531476}">
+<ds:datastoreItem xmlns:ds="http://schemas.openxmlformats.org/officeDocument/2006/customXml" ds:itemID="{B8F91744-F6F4-4DD7-98D9-108B5CE78F85}">
   <ds:schemaRefs>
-    <ds:schemaRef ds:uri="http://schemas.microsoft.com/sharepoint/v3/contenttype/forms"/>
+    <ds:schemaRef ds:uri="http://schemas.microsoft.com/office/2006/metadata/contentType"/>
+    <ds:schemaRef ds:uri="http://schemas.microsoft.com/office/2006/metadata/properties/metaAttributes"/>
+    <ds:schemaRef ds:uri="http://www.w3.org/2001/XMLSchema"/>
+    <ds:schemaRef ds:uri="http://schemas.microsoft.com/office/2006/metadata/properties"/>
+    <ds:schemaRef ds:uri="3fcda13f-2903-41b7-b192-baf7b356d0a8"/>
+    <ds:schemaRef ds:uri="17a9adf4-9a1b-4240-81a0-63b7c14ff34a"/>
+    <ds:schemaRef ds:uri="http://schemas.microsoft.com/office/2006/documentManagement/types"/>
+    <ds:schemaRef ds:uri="http://schemas.microsoft.com/office/infopath/2007/PartnerControls"/>
+    <ds:schemaRef ds:uri="http://schemas.openxmlformats.org/package/2006/metadata/core-properties"/>
+    <ds:schemaRef ds:uri="http://purl.org/dc/elements/1.1/"/>
+    <ds:schemaRef ds:uri="http://purl.org/dc/terms/"/>
+    <ds:schemaRef ds:uri="http://schemas.microsoft.com/internal/obd"/>
   </ds:schemaRefs>
 </ds:datastoreItem>
 </file>
@@ -11459,20 +11451,9 @@
 </file>
 
 <file path=customXml/itemProps3.xml><?xml version="1.0" encoding="utf-8"?>
-<ds:datastoreItem xmlns:ds="http://schemas.openxmlformats.org/officeDocument/2006/customXml" ds:itemID="{B8F91744-F6F4-4DD7-98D9-108B5CE78F85}">
+<ds:datastoreItem xmlns:ds="http://schemas.openxmlformats.org/officeDocument/2006/customXml" ds:itemID="{3577A3A9-82C0-47A6-A1C5-B6DE42531476}">
   <ds:schemaRefs>
-    <ds:schemaRef ds:uri="http://schemas.microsoft.com/office/2006/metadata/contentType"/>
-    <ds:schemaRef ds:uri="http://schemas.microsoft.com/office/2006/metadata/properties/metaAttributes"/>
-    <ds:schemaRef ds:uri="http://www.w3.org/2001/XMLSchema"/>
-    <ds:schemaRef ds:uri="http://schemas.microsoft.com/office/2006/metadata/properties"/>
-    <ds:schemaRef ds:uri="3fcda13f-2903-41b7-b192-baf7b356d0a8"/>
-    <ds:schemaRef ds:uri="17a9adf4-9a1b-4240-81a0-63b7c14ff34a"/>
-    <ds:schemaRef ds:uri="http://schemas.microsoft.com/office/2006/documentManagement/types"/>
-    <ds:schemaRef ds:uri="http://schemas.microsoft.com/office/infopath/2007/PartnerControls"/>
-    <ds:schemaRef ds:uri="http://schemas.openxmlformats.org/package/2006/metadata/core-properties"/>
-    <ds:schemaRef ds:uri="http://purl.org/dc/elements/1.1/"/>
-    <ds:schemaRef ds:uri="http://purl.org/dc/terms/"/>
-    <ds:schemaRef ds:uri="http://schemas.microsoft.com/internal/obd"/>
+    <ds:schemaRef ds:uri="http://schemas.microsoft.com/sharepoint/v3/contenttype/forms"/>
   </ds:schemaRefs>
 </ds:datastoreItem>
 </file>
</xml_diff>